<commit_message>
Square brackets manual fix 2
</commit_message>
<xml_diff>
--- a/bank/task_09/variant_06.docx
+++ b/bank/task_09/variant_06.docx
@@ -191,7 +191,25 @@
             <w:bdr w:val="none" w:sz="0" w:space="0" w:color="auto" w:frame="1"/>
             <w:lang w:eastAsia="ru-RU"/>
           </w:rPr>
-          <m:t>x&lt;-10</m:t>
+          <m:t>x&lt;</m:t>
+        </m:r>
+        <m:r>
+          <w:rPr>
+            <w:rFonts w:ascii="Cambria Math" w:eastAsia="Times New Roman" w:hAnsi="Cambria Math"/>
+            <w:szCs w:val="28"/>
+            <w:bdr w:val="none" w:sz="0" w:space="0" w:color="auto" w:frame="1"/>
+            <w:lang w:eastAsia="ru-RU"/>
+          </w:rPr>
+          <m:t xml:space="preserve"> </m:t>
+        </m:r>
+        <m:r>
+          <w:rPr>
+            <w:rFonts w:ascii="Cambria Math" w:eastAsia="Times New Roman" w:hAnsi="Cambria Math"/>
+            <w:szCs w:val="28"/>
+            <w:bdr w:val="none" w:sz="0" w:space="0" w:color="auto" w:frame="1"/>
+            <w:lang w:eastAsia="ru-RU"/>
+          </w:rPr>
+          <m:t>-10</m:t>
         </m:r>
       </m:oMath>
     </w:p>
@@ -251,7 +269,25 @@
             <w:bdr w:val="none" w:sz="0" w:space="0" w:color="auto" w:frame="1"/>
             <w:lang w:eastAsia="ru-RU"/>
           </w:rPr>
-          <m:t>x&lt;-6</m:t>
+          <m:t>x&lt;</m:t>
+        </m:r>
+        <m:r>
+          <w:rPr>
+            <w:rFonts w:ascii="Cambria Math" w:eastAsia="Times New Roman" w:hAnsi="Cambria Math"/>
+            <w:szCs w:val="28"/>
+            <w:bdr w:val="none" w:sz="0" w:space="0" w:color="auto" w:frame="1"/>
+            <w:lang w:eastAsia="ru-RU"/>
+          </w:rPr>
+          <m:t xml:space="preserve"> </m:t>
+        </m:r>
+        <m:r>
+          <w:rPr>
+            <w:rFonts w:ascii="Cambria Math" w:eastAsia="Times New Roman" w:hAnsi="Cambria Math"/>
+            <w:szCs w:val="28"/>
+            <w:bdr w:val="none" w:sz="0" w:space="0" w:color="auto" w:frame="1"/>
+            <w:lang w:eastAsia="ru-RU"/>
+          </w:rPr>
+          <m:t>-6</m:t>
         </m:r>
       </m:oMath>
     </w:p>

</xml_diff>